<commit_message>
cambio en el notebook
</commit_message>
<xml_diff>
--- a/Reporte_MiniProyecto_NLP.docx
+++ b/Reporte_MiniProyecto_NLP.docx
@@ -553,6 +553,12 @@
       <w:r>
         <w:t xml:space="preserve"> el tiempo adicional de entrenamiento.</w:t>
       </w:r>
+    </w:p>
+    <w:p>
+      <w:pPr>
+        <w:spacing w:before="80" w:after="80" w:line="276" w:lineRule="auto"/>
+        <w:jc w:val="both"/>
+      </w:pPr>
     </w:p>
     <w:p>
       <w:pPr>
@@ -873,7 +879,14 @@
                 <w:sz w:val="20"/>
                 <w:szCs w:val="20"/>
               </w:rPr>
-              <w:t xml:space="preserve">3. </w:t>
+              <w:t>1</w:t>
+            </w:r>
+            <w:r>
+              <w:rPr>
+                <w:sz w:val="20"/>
+                <w:szCs w:val="20"/>
+              </w:rPr>
+              <w:t xml:space="preserve">. </w:t>
             </w:r>
             <w:proofErr w:type="spellStart"/>
             <w:r>
@@ -1056,7 +1069,14 @@
                 <w:sz w:val="20"/>
                 <w:szCs w:val="20"/>
               </w:rPr>
-              <w:t xml:space="preserve">4. </w:t>
+              <w:t>2</w:t>
+            </w:r>
+            <w:r>
+              <w:rPr>
+                <w:sz w:val="20"/>
+                <w:szCs w:val="20"/>
+              </w:rPr>
+              <w:t xml:space="preserve">. </w:t>
             </w:r>
             <w:proofErr w:type="spellStart"/>
             <w:r>
@@ -1192,7 +1212,21 @@
                 <w:sz w:val="20"/>
                 <w:szCs w:val="20"/>
               </w:rPr>
-              <w:t>0.91**</w:t>
+              <w:t>0.9</w:t>
+            </w:r>
+            <w:r>
+              <w:rPr>
+                <w:sz w:val="20"/>
+                <w:szCs w:val="20"/>
+              </w:rPr>
+              <w:t>380</w:t>
+            </w:r>
+            <w:r>
+              <w:rPr>
+                <w:sz w:val="20"/>
+                <w:szCs w:val="20"/>
+              </w:rPr>
+              <w:t>**</w:t>
             </w:r>
           </w:p>
         </w:tc>
@@ -1214,6 +1248,12 @@
             </w:tcMar>
           </w:tcPr>
           <w:p>
+            <w:pPr>
+              <w:rPr>
+                <w:sz w:val="20"/>
+                <w:szCs w:val="20"/>
+              </w:rPr>
+            </w:pPr>
             <w:r>
               <w:rPr>
                 <w:sz w:val="20"/>
@@ -1236,6 +1276,196 @@
                 <w:szCs w:val="20"/>
               </w:rPr>
               <w:t xml:space="preserve"> adapta vocabulario anime. Pequeños errores en ironía extrema.</w:t>
+            </w:r>
+          </w:p>
+          <w:p/>
+        </w:tc>
+      </w:tr>
+      <w:tr>
+        <w:tc>
+          <w:tcPr>
+            <w:tcW w:w="1700" w:type="dxa"/>
+            <w:tcBorders>
+              <w:top w:val="single" w:sz="1" w:space="0" w:color="CCCCCC"/>
+              <w:left w:val="single" w:sz="1" w:space="0" w:color="CCCCCC"/>
+              <w:bottom w:val="single" w:sz="1" w:space="0" w:color="CCCCCC"/>
+              <w:right w:val="single" w:sz="1" w:space="0" w:color="CCCCCC"/>
+            </w:tcBorders>
+            <w:shd w:val="clear" w:color="auto" w:fill="EEF2F7"/>
+            <w:tcMar>
+              <w:top w:w="80" w:type="dxa"/>
+              <w:left w:w="120" w:type="dxa"/>
+              <w:bottom w:w="80" w:type="dxa"/>
+              <w:right w:w="120" w:type="dxa"/>
+            </w:tcMar>
+          </w:tcPr>
+          <w:p>
+            <w:pPr>
+              <w:rPr>
+                <w:sz w:val="20"/>
+                <w:szCs w:val="20"/>
+              </w:rPr>
+            </w:pPr>
+            <w:r>
+              <w:rPr>
+                <w:sz w:val="20"/>
+                <w:szCs w:val="20"/>
+              </w:rPr>
+              <w:t>3.</w:t>
+            </w:r>
+            <w:r>
+              <w:rPr>
+                <w:sz w:val="20"/>
+                <w:szCs w:val="20"/>
+              </w:rPr>
+              <w:t xml:space="preserve">TF-IDF + </w:t>
+            </w:r>
+            <w:proofErr w:type="spellStart"/>
+            <w:r>
+              <w:rPr>
+                <w:sz w:val="20"/>
+                <w:szCs w:val="20"/>
+              </w:rPr>
+              <w:t>LogReg</w:t>
+            </w:r>
+            <w:proofErr w:type="spellEnd"/>
+          </w:p>
+        </w:tc>
+        <w:tc>
+          <w:tcPr>
+            <w:tcW w:w="2400" w:type="dxa"/>
+            <w:tcBorders>
+              <w:top w:val="single" w:sz="1" w:space="0" w:color="CCCCCC"/>
+              <w:left w:val="single" w:sz="1" w:space="0" w:color="CCCCCC"/>
+              <w:bottom w:val="single" w:sz="1" w:space="0" w:color="CCCCCC"/>
+              <w:right w:val="single" w:sz="1" w:space="0" w:color="CCCCCC"/>
+            </w:tcBorders>
+            <w:shd w:val="clear" w:color="auto" w:fill="EEF2F7"/>
+            <w:tcMar>
+              <w:top w:w="80" w:type="dxa"/>
+              <w:left w:w="120" w:type="dxa"/>
+              <w:bottom w:w="80" w:type="dxa"/>
+              <w:right w:w="120" w:type="dxa"/>
+            </w:tcMar>
+          </w:tcPr>
+          <w:p>
+            <w:pPr>
+              <w:rPr>
+                <w:sz w:val="20"/>
+                <w:szCs w:val="20"/>
+              </w:rPr>
+            </w:pPr>
+            <w:proofErr w:type="spellStart"/>
+            <w:r>
+              <w:rPr>
+                <w:sz w:val="20"/>
+                <w:szCs w:val="20"/>
+              </w:rPr>
+              <w:t>max_features</w:t>
+            </w:r>
+            <w:proofErr w:type="spellEnd"/>
+            <w:r>
+              <w:rPr>
+                <w:sz w:val="20"/>
+                <w:szCs w:val="20"/>
+              </w:rPr>
+              <w:t xml:space="preserve">=50,000, </w:t>
+            </w:r>
+            <w:proofErr w:type="spellStart"/>
+            <w:r>
+              <w:rPr>
+                <w:sz w:val="20"/>
+                <w:szCs w:val="20"/>
+              </w:rPr>
+              <w:t>ngram_range</w:t>
+            </w:r>
+            <w:proofErr w:type="spellEnd"/>
+            <w:r>
+              <w:rPr>
+                <w:sz w:val="20"/>
+                <w:szCs w:val="20"/>
+              </w:rPr>
+              <w:t>=(1,2), C=1.</w:t>
+            </w:r>
+            <w:r>
+              <w:rPr>
+                <w:sz w:val="20"/>
+                <w:szCs w:val="20"/>
+              </w:rPr>
+              <w:t>0</w:t>
+            </w:r>
+          </w:p>
+        </w:tc>
+        <w:tc>
+          <w:tcPr>
+            <w:tcW w:w="1400" w:type="dxa"/>
+            <w:tcBorders>
+              <w:top w:val="single" w:sz="1" w:space="0" w:color="CCCCCC"/>
+              <w:left w:val="single" w:sz="1" w:space="0" w:color="CCCCCC"/>
+              <w:bottom w:val="single" w:sz="1" w:space="0" w:color="CCCCCC"/>
+              <w:right w:val="single" w:sz="1" w:space="0" w:color="CCCCCC"/>
+            </w:tcBorders>
+            <w:shd w:val="clear" w:color="auto" w:fill="EEF2F7"/>
+            <w:tcMar>
+              <w:top w:w="80" w:type="dxa"/>
+              <w:left w:w="120" w:type="dxa"/>
+              <w:bottom w:w="80" w:type="dxa"/>
+              <w:right w:w="120" w:type="dxa"/>
+            </w:tcMar>
+          </w:tcPr>
+          <w:p>
+            <w:pPr>
+              <w:rPr>
+                <w:sz w:val="20"/>
+                <w:szCs w:val="20"/>
+              </w:rPr>
+            </w:pPr>
+            <w:r>
+              <w:rPr>
+                <w:sz w:val="20"/>
+                <w:szCs w:val="20"/>
+              </w:rPr>
+              <w:t>0.9326</w:t>
+            </w:r>
+          </w:p>
+        </w:tc>
+        <w:tc>
+          <w:tcPr>
+            <w:tcW w:w="3860" w:type="dxa"/>
+            <w:tcBorders>
+              <w:top w:val="single" w:sz="1" w:space="0" w:color="CCCCCC"/>
+              <w:left w:val="single" w:sz="1" w:space="0" w:color="CCCCCC"/>
+              <w:bottom w:val="single" w:sz="1" w:space="0" w:color="CCCCCC"/>
+              <w:right w:val="single" w:sz="1" w:space="0" w:color="CCCCCC"/>
+            </w:tcBorders>
+            <w:shd w:val="clear" w:color="auto" w:fill="EEF2F7"/>
+            <w:tcMar>
+              <w:top w:w="80" w:type="dxa"/>
+              <w:left w:w="120" w:type="dxa"/>
+              <w:bottom w:w="80" w:type="dxa"/>
+              <w:right w:w="120" w:type="dxa"/>
+            </w:tcMar>
+          </w:tcPr>
+          <w:p>
+            <w:pPr>
+              <w:rPr>
+                <w:sz w:val="20"/>
+                <w:szCs w:val="20"/>
+              </w:rPr>
+            </w:pPr>
+            <w:r>
+              <w:rPr>
+                <w:sz w:val="20"/>
+                <w:szCs w:val="20"/>
+              </w:rPr>
+              <w:t>Modelo lineal clásico. Competitivo gracias al vocabulario de sentimiento explícito del corpus. Sin capacidad de capturar contexto ni ironía</w:t>
+            </w:r>
+            <w:r>
+              <w:rPr>
+                <w:sz w:val="20"/>
+                <w:szCs w:val="20"/>
+              </w:rPr>
+              <w:t>.</w:t>
             </w:r>
           </w:p>
         </w:tc>
@@ -1253,29 +1483,7 @@
           <w:sz w:val="18"/>
           <w:szCs w:val="18"/>
         </w:rPr>
-        <w:t xml:space="preserve">* F1 macro aproximado basado en los resultados del experimento. ** Resultados sobre </w:t>
-      </w:r>
-      <w:proofErr w:type="gramStart"/>
-      <w:r>
-        <w:rPr>
-          <w:i/>
-          <w:iCs/>
-          <w:color w:val="666666"/>
-          <w:sz w:val="18"/>
-          <w:szCs w:val="18"/>
-        </w:rPr>
-        <w:t>el test</w:t>
-      </w:r>
-      <w:proofErr w:type="gramEnd"/>
-      <w:r>
-        <w:rPr>
-          <w:i/>
-          <w:iCs/>
-          <w:color w:val="666666"/>
-          <w:sz w:val="18"/>
-          <w:szCs w:val="18"/>
-        </w:rPr>
-        <w:t xml:space="preserve"> set del modelo final entrenado.</w:t>
+        <w:t>* F1 macro aproximado basado en los resultados del experimento. ** Resultados sobre el test set del modelo final entrenado.</w:t>
       </w:r>
     </w:p>
     <w:p>
@@ -1297,11 +1505,14 @@
       <w:pPr>
         <w:spacing w:before="80" w:after="80" w:line="276" w:lineRule="auto"/>
         <w:jc w:val="both"/>
-      </w:pPr>
-      <w:r>
         <w:rPr>
           <w:color w:val="000000"/>
         </w:rPr>
+      </w:pPr>
+      <w:r>
+        <w:rPr>
+          <w:color w:val="000000"/>
+        </w:rPr>
         <w:t xml:space="preserve">Lo que más nos sorprendió fue el impacto del preentrenamiento MLM. Antes de hacerlo asumíamos que </w:t>
       </w:r>
       <w:proofErr w:type="spellStart"/>
@@ -1332,6 +1543,81 @@
         </w:rPr>
         <w:t xml:space="preserve"> supervisado, pero los resultados mostraron claramente que no era así. El modelo base cometía errores consistentes en reseñas con jerga específica del anime, que desaparecieron en gran medida después del MLM.</w:t>
       </w:r>
+    </w:p>
+    <w:p>
+      <w:pPr>
+        <w:spacing w:before="80" w:after="80" w:line="276" w:lineRule="auto"/>
+        <w:jc w:val="both"/>
+      </w:pPr>
+      <w:r>
+        <w:t xml:space="preserve">El modelo TF-IDF + Regresión Logística alcanzó un resultado comparable al </w:t>
+      </w:r>
+      <w:proofErr w:type="spellStart"/>
+      <w:r>
+        <w:t>DistilBERT</w:t>
+      </w:r>
+      <w:proofErr w:type="spellEnd"/>
+      <w:r>
+        <w:t xml:space="preserve"> sin MLM e incluso superior al esperado. Esto</w:t>
+      </w:r>
+      <w:r>
+        <w:t xml:space="preserve"> probablemente porque</w:t>
+      </w:r>
+      <w:r>
+        <w:t xml:space="preserve"> las reseñas de anime tienden a expresar el sentimiento de forma directa y léxicamente explícita ("</w:t>
+      </w:r>
+      <w:proofErr w:type="spellStart"/>
+      <w:r>
+        <w:t>masterpiece</w:t>
+      </w:r>
+      <w:proofErr w:type="spellEnd"/>
+      <w:r>
+        <w:t>", "</w:t>
+      </w:r>
+      <w:proofErr w:type="spellStart"/>
+      <w:r>
+        <w:t>boring</w:t>
+      </w:r>
+      <w:proofErr w:type="spellEnd"/>
+      <w:r>
+        <w:t>", "terrible"), lo que favorece a los modelos basados en frecuencia de términos. El valor del modelo profundo se manifiesta en casos de lenguaje implícito, sarcasmo o contexto extendido, menos frecuentes en este dominio.</w:t>
+      </w:r>
+    </w:p>
+    <w:p>
+      <w:pPr>
+        <w:spacing w:before="80" w:after="80" w:line="276" w:lineRule="auto"/>
+        <w:jc w:val="both"/>
+      </w:pPr>
+    </w:p>
+    <w:p>
+      <w:pPr>
+        <w:spacing w:before="80" w:after="80" w:line="276" w:lineRule="auto"/>
+        <w:jc w:val="both"/>
+      </w:pPr>
+    </w:p>
+    <w:p>
+      <w:pPr>
+        <w:spacing w:before="80" w:after="80" w:line="276" w:lineRule="auto"/>
+        <w:jc w:val="both"/>
+      </w:pPr>
+    </w:p>
+    <w:p>
+      <w:pPr>
+        <w:spacing w:before="80" w:after="80" w:line="276" w:lineRule="auto"/>
+        <w:jc w:val="both"/>
+      </w:pPr>
+    </w:p>
+    <w:p>
+      <w:pPr>
+        <w:spacing w:before="80" w:after="80" w:line="276" w:lineRule="auto"/>
+        <w:jc w:val="both"/>
+      </w:pPr>
+    </w:p>
+    <w:p>
+      <w:pPr>
+        <w:spacing w:before="80" w:after="80" w:line="276" w:lineRule="auto"/>
+        <w:jc w:val="both"/>
+      </w:pPr>
     </w:p>
     <w:p>
       <w:pPr>
@@ -2573,7 +2859,6 @@
   <w:style w:type="character" w:default="1" w:styleId="Fuentedeprrafopredeter">
     <w:name w:val="Default Paragraph Font"/>
     <w:uiPriority w:val="1"/>
-    <w:semiHidden/>
     <w:unhideWhenUsed/>
   </w:style>
   <w:style w:type="table" w:default="1" w:styleId="Tablanormal">

</xml_diff>